<commit_message>
Added LangGraph Workflow and updated Frontend
</commit_message>
<xml_diff>
--- a/outputs/business_plan.docx
+++ b/outputs/business_plan.docx
@@ -36,7 +36,7 @@
           <w:rFonts w:ascii="Times New Roman" w:hAnsi="Times New Roman"/>
           <w:sz w:val="28"/>
         </w:rPr>
-        <w:t>AI Tutor - Intelligent Learning Companion for Students</w:t>
+        <w:t>An urban fish market providing fresh seafood in cities without direct river access.</w:t>
       </w:r>
     </w:p>
     <w:p>
@@ -55,7 +55,7 @@
           <w:rFonts w:ascii="Times New Roman" w:hAnsi="Times New Roman"/>
           <w:sz w:val="28"/>
         </w:rPr>
-        <w:t>AI Tutor - Intelligent Learning Companion for Students</w:t>
+        <w:t>An urban fish market providing fresh seafood in cities without direct river access.</w:t>
       </w:r>
     </w:p>
     <w:p>
@@ -81,7 +81,7 @@
           <w:rFonts w:ascii="Times New Roman" w:hAnsi="Times New Roman"/>
           <w:sz w:val="28"/>
         </w:rPr>
-        <w:t>The AI Tutor aims to address the challenges faced by students in managing their studies, staying organized, and improving learning outcomes. This includes difficulties with time management, understanding complex concepts, and accessing personalized resources for academic success.</w:t>
+        <w:t>The lack of easy access to fresh, locally-sourced seafood for urban dwellers who reside in cities with no rivers or coastal areas. This problem results in residents either consuming lower quality or non-local seafood, or having limited choices.</w:t>
       </w:r>
     </w:p>
     <w:p>
@@ -107,7 +107,7 @@
           <w:rFonts w:ascii="Times New Roman" w:hAnsi="Times New Roman"/>
           <w:sz w:val="28"/>
         </w:rPr>
-        <w:t>Our primary target users are high school and college-level students seeking a comprehensive study companion that adapts to individual learning styles, offers personalized recommendations, and assists with organization and productivity. Additionally, parents of these students may also benefit from the app as it helps monitor their child's academic progress and provides guidance on areas needing improvement.</w:t>
+        <w:t>Urban residents living in landlocked cities, specifically those who prefer to consume fresh and locally-sourced seafood. This could also include restaurants, hotels, and other businesses that cater to customers seeking such options.</w:t>
       </w:r>
     </w:p>
     <w:p>
@@ -133,43 +133,7 @@
           <w:rFonts w:ascii="Times New Roman" w:hAnsi="Times New Roman"/>
           <w:sz w:val="28"/>
         </w:rPr>
-        <w:t>1. AI-powered tutor that offers personalized learning plans based on individual student's strengths, weaknesses, and learning style.</w:t>
-      </w:r>
-    </w:p>
-    <w:p>
-      <w:r>
-        <w:rPr>
-          <w:rFonts w:ascii="Times New Roman" w:hAnsi="Times New Roman"/>
-          <w:sz w:val="28"/>
-        </w:rPr>
-        <w:t>2. Intelligent resource recommendation system to help students easily access relevant study materials, tutorials, and practice exercises.</w:t>
-      </w:r>
-    </w:p>
-    <w:p>
-      <w:r>
-        <w:rPr>
-          <w:rFonts w:ascii="Times New Roman" w:hAnsi="Times New Roman"/>
-          <w:sz w:val="28"/>
-        </w:rPr>
-        <w:t>3. Advanced time management features like scheduling, reminders, and progress tracking to ensure effective study habits and improved grades.</w:t>
-      </w:r>
-    </w:p>
-    <w:p>
-      <w:r>
-        <w:rPr>
-          <w:rFonts w:ascii="Times New Roman" w:hAnsi="Times New Roman"/>
-          <w:sz w:val="28"/>
-        </w:rPr>
-        <w:t>4. Accessibility across multiple platforms (mobile, web, smart home devices) for a seamless learning experience anytime, anywhere.</w:t>
-      </w:r>
-    </w:p>
-    <w:p>
-      <w:r>
-        <w:rPr>
-          <w:rFonts w:ascii="Times New Roman" w:hAnsi="Times New Roman"/>
-          <w:sz w:val="28"/>
-        </w:rPr>
-        <w:t>5. Integration with school management systems to provide real-time updates on assignments, test scores, and attendance records for an up-to-date academic overview.</w:t>
+        <w:t>Our urban fish market offers a unique solution by sourcing high-quality, fresh seafood directly from fisheries across the region and bringing it right into the heart of cities without river access. By doing so, we bridge the gap between rural fishing communities and city dwellers, providing a convenient and diverse selection of seafood while promoting local economies and sustainable practices.</w:t>
       </w:r>
     </w:p>
     <w:p>
@@ -197,7 +161,7 @@
           <w:rFonts w:ascii="Times New Roman" w:hAnsi="Times New Roman"/>
           <w:sz w:val="28"/>
         </w:rPr>
-        <w:t>High demand for personalized and adaptive learning solutions, particularly in the education sector. The COVID-19 pandemic has further accelerated the need for online learning tools and tutoring services.</w:t>
+        <w:t>High demand for fresh, sustainable seafood among urban dwellers seeking healthier food options and gourmet experiences.</w:t>
       </w:r>
     </w:p>
     <w:p>
@@ -223,7 +187,7 @@
           <w:rFonts w:ascii="Times New Roman" w:hAnsi="Times New Roman"/>
           <w:sz w:val="28"/>
         </w:rPr>
-        <w:t>Global online education market size is expected to reach USD 350 billion by 2026, growing at a CAGR of around 9% from 2019 to 2026. The AI in education market is estimated to grow at a CAGR of over 40% during the forecast period 2020-2025.</w:t>
+        <w:t>The target market size is significant as cities without direct river access still have a population of millions who consume seafood regularly. Potential customers could range from individuals to restaurants and supermarkets.</w:t>
       </w:r>
     </w:p>
     <w:p>
@@ -249,7 +213,7 @@
           <w:rFonts w:ascii="Times New Roman" w:hAnsi="Times New Roman"/>
           <w:sz w:val="28"/>
         </w:rPr>
-        <w:t>Khan Academy, Coursera, EdX, Brainly, Tutor.com, and Top Hat. Other AI-based competitors include IBM's Watson Education and Cognitive Tutor.</w:t>
+        <w:t>Traditional fish markets, online fish retailers, gourmet grocery stores, and large-scale supermarket chains that offer frozen seafood options. Local farmers' markets might also provide fresh seafood during certain seasons.</w:t>
       </w:r>
     </w:p>
     <w:p>
@@ -275,7 +239,7 @@
           <w:rFonts w:ascii="Times New Roman" w:hAnsi="Times New Roman"/>
           <w:sz w:val="28"/>
         </w:rPr>
-        <w:t>Rising demand for personalized learning experiences, integration of AR/VR in education, increasing investment in edtech startups, growth of mobile learning, and the use of AI and machine learning to improve efficiency and effectiveness of learning platforms.</w:t>
+        <w:t>Growing interest in locally sourced food products, sustainable farming practices, and the desire for unique culinary experiences are key trends that could positively impact this startup idea. Additionally, increasing health consciousness among consumers may drive demand for fresh, high-quality seafood over processed alternatives.</w:t>
       </w:r>
     </w:p>
     <w:p>
@@ -303,7 +267,7 @@
           <w:rFonts w:ascii="Times New Roman" w:hAnsi="Times New Roman"/>
           <w:sz w:val="28"/>
         </w:rPr>
-        <w:t>1. Subscription-based model for individual users (monthly/yearly)</w:t>
+        <w:t>1. Sales of fresh seafood (fish, shellfish, etc.) to consumers and businesses (restaurants, caterers) in urban areas.</w:t>
       </w:r>
     </w:p>
     <w:p>
@@ -312,43 +276,7 @@
           <w:rFonts w:ascii="Times New Roman" w:hAnsi="Times New Roman"/>
           <w:sz w:val="28"/>
         </w:rPr>
-        <w:t>2. Partnership with educational institutions for bulk subscriptions and integration into their learning management systems</w:t>
-      </w:r>
-    </w:p>
-    <w:p>
-      <w:r>
-        <w:rPr>
-          <w:rFonts w:ascii="Times New Roman" w:hAnsi="Times New Roman"/>
-          <w:sz w:val="28"/>
-        </w:rPr>
-        <w:t>3. In-app purchases for premium features like personalized study plans, test simulators, and access to advanced AI capabilities</w:t>
-      </w:r>
-    </w:p>
-    <w:p>
-      <w:r>
-        <w:rPr>
-          <w:rFonts w:ascii="Times New Roman" w:hAnsi="Times New Roman"/>
-          <w:sz w:val="28"/>
-        </w:rPr>
-        <w:t>4. Advertising revenue from educational content partners or related services</w:t>
-      </w:r>
-    </w:p>
-    <w:p>
-      <w:r>
-        <w:rPr>
-          <w:rFonts w:ascii="Times New Roman" w:hAnsi="Times New Roman"/>
-          <w:sz w:val="28"/>
-        </w:rPr>
-        <w:t>5. Licensing the AI technology to third parties for their own educational products or services</w:t>
-      </w:r>
-    </w:p>
-    <w:p>
-      <w:r>
-        <w:rPr>
-          <w:rFonts w:ascii="Times New Roman" w:hAnsi="Times New Roman"/>
-          <w:sz w:val="28"/>
-        </w:rPr>
-        <w:t>6. Affiliate marketing with partnered e-learning content providers</w:t>
+        <w:t>2. Potential additional revenue streams could include value-added products such as prepared meals, seafood recipes, or cooking classes.</w:t>
       </w:r>
     </w:p>
     <w:p>
@@ -374,7 +302,7 @@
           <w:rFonts w:ascii="Times New Roman" w:hAnsi="Times New Roman"/>
           <w:sz w:val="28"/>
         </w:rPr>
-        <w:t>1. Tiered pricing based on features, starting with a basic free version and gradually increasing price points for additional benefits</w:t>
+        <w:t>1. Competitive pricing for fresh seafood, maintaining a premium positioning due to high quality and freshness of the product.</w:t>
       </w:r>
     </w:p>
     <w:p>
@@ -383,7 +311,7 @@
           <w:rFonts w:ascii="Times New Roman" w:hAnsi="Times New Roman"/>
           <w:sz w:val="28"/>
         </w:rPr>
-        <w:t>2. Discounts for longer subscription periods (e.g., annual vs monthly)</w:t>
+        <w:t>2. Seasonal price adjustments based on availability and demand for certain species.</w:t>
       </w:r>
     </w:p>
     <w:p>
@@ -392,7 +320,7 @@
           <w:rFonts w:ascii="Times New Roman" w:hAnsi="Times New Roman"/>
           <w:sz w:val="28"/>
         </w:rPr>
-        <w:t>3. Offer flexible pricing plans for students of different income levels or circumstances</w:t>
+        <w:t>3. Discounts or loyalty programs for repeat customers.</w:t>
       </w:r>
     </w:p>
     <w:p>
@@ -401,25 +329,7 @@
           <w:rFonts w:ascii="Times New Roman" w:hAnsi="Times New Roman"/>
           <w:sz w:val="28"/>
         </w:rPr>
-        <w:t>4. Price differentiation between individual users and educational institutions based on volume and specific needs</w:t>
-      </w:r>
-    </w:p>
-    <w:p>
-      <w:r>
-        <w:rPr>
-          <w:rFonts w:ascii="Times New Roman" w:hAnsi="Times New Roman"/>
-          <w:sz w:val="28"/>
-        </w:rPr>
-        <w:t>5. Freemium model to attract users, then up-sell premium features</w:t>
-      </w:r>
-    </w:p>
-    <w:p>
-      <w:r>
-        <w:rPr>
-          <w:rFonts w:ascii="Times New Roman" w:hAnsi="Times New Roman"/>
-          <w:sz w:val="28"/>
-        </w:rPr>
-        <w:t>6. Implement trial periods for premium subscriptions to reduce customer hesitation</w:t>
+        <w:t>4. Pricing differentiation between consumer and business clients.</w:t>
       </w:r>
     </w:p>
     <w:p>
@@ -445,7 +355,7 @@
           <w:rFonts w:ascii="Times New Roman" w:hAnsi="Times New Roman"/>
           <w:sz w:val="28"/>
         </w:rPr>
-        <w:t>1. Development costs (AI technology, software development, UI/UX design)</w:t>
+        <w:t>1. Seafood sourcing costs, including transportation expenses to bring the seafood from coastal areas to the urban market.</w:t>
       </w:r>
     </w:p>
     <w:p>
@@ -454,7 +364,7 @@
           <w:rFonts w:ascii="Times New Roman" w:hAnsi="Times New Roman"/>
           <w:sz w:val="28"/>
         </w:rPr>
-        <w:t>2. Infrastructure expenses (servers, data storage, network)</w:t>
+        <w:t>2. Rent and utilities for the physical location of the market in the city.</w:t>
       </w:r>
     </w:p>
     <w:p>
@@ -463,7 +373,7 @@
           <w:rFonts w:ascii="Times New Roman" w:hAnsi="Times New Roman"/>
           <w:sz w:val="28"/>
         </w:rPr>
-        <w:t>3. Marketing and advertising costs (digital marketing, influencer partnerships, content creation)</w:t>
+        <w:t>3. Staff salaries, training, and benefits.</w:t>
       </w:r>
     </w:p>
     <w:p>
@@ -472,7 +382,7 @@
           <w:rFonts w:ascii="Times New Roman" w:hAnsi="Times New Roman"/>
           <w:sz w:val="28"/>
         </w:rPr>
-        <w:t>4. Customer support (technical assistance, educational resources, tutor services)</w:t>
+        <w:t>4. Marketing and advertising expenses to promote the business and attract customers.</w:t>
       </w:r>
     </w:p>
     <w:p>
@@ -481,25 +391,7 @@
           <w:rFonts w:ascii="Times New Roman" w:hAnsi="Times New Roman"/>
           <w:sz w:val="28"/>
         </w:rPr>
-        <w:t>5. Research &amp; Development for continuous AI improvement and feature development</w:t>
-      </w:r>
-    </w:p>
-    <w:p>
-      <w:r>
-        <w:rPr>
-          <w:rFonts w:ascii="Times New Roman" w:hAnsi="Times New Roman"/>
-          <w:sz w:val="28"/>
-        </w:rPr>
-        <w:t>6. Employee salaries, benefits, and office expenses</w:t>
-      </w:r>
-    </w:p>
-    <w:p>
-      <w:r>
-        <w:rPr>
-          <w:rFonts w:ascii="Times New Roman" w:hAnsi="Times New Roman"/>
-          <w:sz w:val="28"/>
-        </w:rPr>
-        <w:t>7. Legal and compliance fees (IP protection, data privacy, etc.)</w:t>
+        <w:t>5. Miscellaneous costs such as insurance, permits, and maintenance.</w:t>
       </w:r>
     </w:p>
     <w:p>
@@ -525,7 +417,7 @@
           <w:rFonts w:ascii="Times New Roman" w:hAnsi="Times New Roman"/>
           <w:sz w:val="28"/>
         </w:rPr>
-        <w:t>1. Educational content providers to offer comprehensive learning materials and resources within the platform</w:t>
+        <w:t>1. Seafood suppliers or wholesalers with access to fresh catch from coastal areas.</w:t>
       </w:r>
     </w:p>
     <w:p>
@@ -534,7 +426,7 @@
           <w:rFonts w:ascii="Times New Roman" w:hAnsi="Times New Roman"/>
           <w:sz w:val="28"/>
         </w:rPr>
-        <w:t>2. Tech companies specializing in AI and machine learning for collaboration and integration of advanced capabilities</w:t>
+        <w:t>2. Local fisheries and aquaculture operations (where applicable) for sustainable sourcing options.</w:t>
       </w:r>
     </w:p>
     <w:p>
@@ -543,7 +435,7 @@
           <w:rFonts w:ascii="Times New Roman" w:hAnsi="Times New Roman"/>
           <w:sz w:val="28"/>
         </w:rPr>
-        <w:t>3. EdTech industry influencers and thought leaders to promote the AI Tutor brand and attract users</w:t>
+        <w:t>3. Logistics partners for transportation of seafood from the source to the market location.</w:t>
       </w:r>
     </w:p>
     <w:p>
@@ -552,7 +444,7 @@
           <w:rFonts w:ascii="Times New Roman" w:hAnsi="Times New Roman"/>
           <w:sz w:val="28"/>
         </w:rPr>
-        <w:t>4. Educational institutions for integration into their learning management systems and collaboration on curriculum development</w:t>
+        <w:t>4. City government agencies for permits, regulations, and potential collaborations on events or promotions.</w:t>
       </w:r>
     </w:p>
     <w:p>
@@ -561,16 +453,7 @@
           <w:rFonts w:ascii="Times New Roman" w:hAnsi="Times New Roman"/>
           <w:sz w:val="28"/>
         </w:rPr>
-        <w:t>5. Data analytics firms for insights on user behavior, market trends, and performance metrics</w:t>
-      </w:r>
-    </w:p>
-    <w:p>
-      <w:r>
-        <w:rPr>
-          <w:rFonts w:ascii="Times New Roman" w:hAnsi="Times New Roman"/>
-          <w:sz w:val="28"/>
-        </w:rPr>
-        <w:t>6. Content creators and educators as consultants or subject matter experts to help curate educational content and ensure accuracy and relevance</w:t>
+        <w:t>5. Marketing and advertising agencies to help promote the business to target customers in the urban area.</w:t>
       </w:r>
     </w:p>
     <w:p>
@@ -589,7 +472,7 @@
           <w:rFonts w:ascii="Times New Roman" w:hAnsi="Times New Roman"/>
           <w:sz w:val="28"/>
         </w:rPr>
-        <w:t xml:space="preserve"> Target Audience: K-12 students, college students, parents, educators, and educational institutions seeking advanced learning tools.</w:t>
+        <w:t xml:space="preserve"> Target Audience: City dwellers, seafood enthusiasts, families, health-conscious individuals, and restaurants/chefs seeking high-quality fresh seafood.</w:t>
       </w:r>
     </w:p>
     <w:p>
@@ -606,97 +489,7 @@
           <w:rFonts w:ascii="Times New Roman" w:hAnsi="Times New Roman"/>
           <w:sz w:val="28"/>
         </w:rPr>
-        <w:t>Marketing Channels:</w:t>
-      </w:r>
-    </w:p>
-    <w:p>
-      <w:r>
-        <w:rPr>
-          <w:rFonts w:ascii="Times New Roman" w:hAnsi="Times New Roman"/>
-          <w:sz w:val="28"/>
-        </w:rPr>
-        <w:t>1. Social Media Advertising (Facebook, Instagram, Twitter, LinkedIn)</w:t>
-      </w:r>
-    </w:p>
-    <w:p>
-      <w:r>
-        <w:rPr>
-          <w:rFonts w:ascii="Times New Roman" w:hAnsi="Times New Roman"/>
-          <w:sz w:val="28"/>
-        </w:rPr>
-        <w:t>2. Influencer Marketing (Educational influencers, YouTubers, TikTokers)</w:t>
-      </w:r>
-    </w:p>
-    <w:p>
-      <w:r>
-        <w:rPr>
-          <w:rFonts w:ascii="Times New Roman" w:hAnsi="Times New Roman"/>
-          <w:sz w:val="28"/>
-        </w:rPr>
-        <w:t>3. Google Ads (Search Network and Display Network)</w:t>
-      </w:r>
-    </w:p>
-    <w:p>
-      <w:r>
-        <w:rPr>
-          <w:rFonts w:ascii="Times New Roman" w:hAnsi="Times New Roman"/>
-          <w:sz w:val="28"/>
-        </w:rPr>
-        <w:t>4. Email marketing (for newsletters, updates, promotions)</w:t>
-      </w:r>
-    </w:p>
-    <w:p>
-      <w:r>
-        <w:rPr>
-          <w:rFonts w:ascii="Times New Roman" w:hAnsi="Times New Roman"/>
-          <w:sz w:val="28"/>
-        </w:rPr>
-        <w:t>5. Partnerships with educational platforms, schools, and homeschooling communities</w:t>
-      </w:r>
-    </w:p>
-    <w:p>
-      <w:r>
-        <w:rPr>
-          <w:rFonts w:ascii="Times New Roman" w:hAnsi="Times New Roman"/>
-          <w:sz w:val="28"/>
-        </w:rPr>
-        <w:t>6. Content Marketing (Blogs, articles, webinars, videos, podcasts)</w:t>
-      </w:r>
-    </w:p>
-    <w:p>
-      <w:r>
-        <w:rPr>
-          <w:rFonts w:ascii="Times New Roman" w:hAnsi="Times New Roman"/>
-          <w:sz w:val="28"/>
-        </w:rPr>
-        <w:t>7. SEO (Optimizing website for search engines)</w:t>
-      </w:r>
-    </w:p>
-    <w:p>
-      <w:r>
-        <w:rPr>
-          <w:rFonts w:ascii="Times New Roman" w:hAnsi="Times New Roman"/>
-          <w:sz w:val="28"/>
-        </w:rPr>
-        <w:t>8. Paid partnerships with edtech influencers, media outlets, and educational blogs</w:t>
-      </w:r>
-    </w:p>
-    <w:p>
-      <w:r>
-        <w:rPr>
-          <w:rFonts w:ascii="Times New Roman" w:hAnsi="Times New Roman"/>
-          <w:sz w:val="28"/>
-        </w:rPr>
-        <w:t>9. Participation in education-focused events and conferences</w:t>
-      </w:r>
-    </w:p>
-    <w:p>
-      <w:r>
-        <w:rPr>
-          <w:rFonts w:ascii="Times New Roman" w:hAnsi="Times New Roman"/>
-          <w:sz w:val="28"/>
-        </w:rPr>
-        <w:t>10. Word-of-mouth referrals through satisfied users</w:t>
+        <w:t>Marketing Channels: Social media (Instagram, Facebook), Local SEO, Email marketing, Influencer partnerships, Printed flyers &amp; posters in popular areas, Word of mouth referrals, Partnership with local grocery stores, and Hosting educational workshops/tastings.</w:t>
       </w:r>
     </w:p>
     <w:p>
@@ -722,7 +515,7 @@
           <w:rFonts w:ascii="Times New Roman" w:hAnsi="Times New Roman"/>
           <w:sz w:val="28"/>
         </w:rPr>
-        <w:t>1. Offer a free trial period to attract new users and let them experience the benefits of AI Tutor.</w:t>
+        <w:t>1. Utilize social media platforms to showcase the freshness, variety, and quality of seafood offered through engaging content such as recipes, behind-the-scenes looks at the market, customer testimonials, and live videos.</w:t>
       </w:r>
     </w:p>
     <w:p>
@@ -731,7 +524,7 @@
           <w:rFonts w:ascii="Times New Roman" w:hAnsi="Times New Roman"/>
           <w:sz w:val="28"/>
         </w:rPr>
-        <w:t>2. Create engaging and informative content showcasing the unique features and benefits of AI Tutor.</w:t>
+        <w:t>2. Leverage local SEO by optimizing website for relevant keywords related to urban fish markets, high-quality seafood, sustainable options, etc., improving online visibility in search results.</w:t>
       </w:r>
     </w:p>
     <w:p>
@@ -740,7 +533,7 @@
           <w:rFonts w:ascii="Times New Roman" w:hAnsi="Times New Roman"/>
           <w:sz w:val="28"/>
         </w:rPr>
-        <w:t>3. Collaborate with educational influencers to promote AI Tutor, leveraging their credibility and reach among target audiences.</w:t>
+        <w:t>3. Offer promotions or discounts for first-time customers through email marketing and social media channels to drive initial visits and encourage repeat business.</w:t>
       </w:r>
     </w:p>
     <w:p>
@@ -749,7 +542,7 @@
           <w:rFonts w:ascii="Times New Roman" w:hAnsi="Times New Roman"/>
           <w:sz w:val="28"/>
         </w:rPr>
-        <w:t>4. Implement targeted ads on relevant platforms to attract users actively seeking learning tools.</w:t>
+        <w:t>4. Partner with local influencers who cater to the target audience to promote the market through their channels, providing an authentic endorsement.</w:t>
       </w:r>
     </w:p>
     <w:p>
@@ -758,7 +551,7 @@
           <w:rFonts w:ascii="Times New Roman" w:hAnsi="Times New Roman"/>
           <w:sz w:val="28"/>
         </w:rPr>
-        <w:t>5. Offer discounts for bulk subscriptions (schools, homeschooling communities) to incentivize group sign-ups.</w:t>
+        <w:t>5. Distribute printed flyers and posters in popular areas (e.g., near parks, gyms, offices) to reach a broader audience.</w:t>
       </w:r>
     </w:p>
     <w:p>
@@ -767,7 +560,7 @@
           <w:rFonts w:ascii="Times New Roman" w:hAnsi="Times New Roman"/>
           <w:sz w:val="28"/>
         </w:rPr>
-        <w:t>6. Create educational resources (eBooks, webinars, videos) that address common challenges students face in their subjects, positioning AI Tutor as a helpful solution.</w:t>
+        <w:t>6. Collaborate with local grocery stores to offer seafood from the urban fish market, increasing its reach and visibility among customers.</w:t>
       </w:r>
     </w:p>
     <w:p>
@@ -776,16 +569,7 @@
           <w:rFonts w:ascii="Times New Roman" w:hAnsi="Times New Roman"/>
           <w:sz w:val="28"/>
         </w:rPr>
-        <w:t>7. Encourage existing users to refer friends and families, offering rewards for successful referrals.</w:t>
-      </w:r>
-    </w:p>
-    <w:p>
-      <w:r>
-        <w:rPr>
-          <w:rFonts w:ascii="Times New Roman" w:hAnsi="Times New Roman"/>
-          <w:sz w:val="28"/>
-        </w:rPr>
-        <w:t>8. Provide excellent customer service to build strong relationships with users and encourage ongoing usage and positive word-of-mouth.</w:t>
+        <w:t>7. Host educational workshops or tastings featuring different types of seafood, cooking demonstrations, and sustainable fishing practices to engage potential customers and promote the brand's expertise in the industry.</w:t>
       </w:r>
     </w:p>
     <w:p>
@@ -811,7 +595,7 @@
           <w:rFonts w:ascii="Times New Roman" w:hAnsi="Times New Roman"/>
           <w:sz w:val="28"/>
         </w:rPr>
-        <w:t>1. Continuously iterate based on user feedback to improve the product and enhance user satisfaction.</w:t>
+        <w:t>1. Continuously gather customer feedback to understand their needs and preferences, allowing for tailoring marketing efforts and product offerings accordingly.</w:t>
       </w:r>
     </w:p>
     <w:p>
@@ -820,7 +604,7 @@
           <w:rFonts w:ascii="Times New Roman" w:hAnsi="Times New Roman"/>
           <w:sz w:val="28"/>
         </w:rPr>
-        <w:t>2. Expand content offerings to cover a wide range of subjects, grade levels, and learning styles to cater to diverse needs.</w:t>
+        <w:t>2. Expand partnerships with local grocery stores, restaurants, and influencers to reach a wider audience and increase market share.</w:t>
       </w:r>
     </w:p>
     <w:p>
@@ -829,7 +613,7 @@
           <w:rFonts w:ascii="Times New Roman" w:hAnsi="Times New Roman"/>
           <w:sz w:val="28"/>
         </w:rPr>
-        <w:t>3. Implement machine learning algorithms to personalize the learning experience for each user.</w:t>
+        <w:t>3. Invest in improving the overall customer experience by offering exceptional service, maintaining high-quality seafood, and creating an inviting atmosphere at the market.</w:t>
       </w:r>
     </w:p>
     <w:p>
@@ -838,7 +622,7 @@
           <w:rFonts w:ascii="Times New Roman" w:hAnsi="Times New Roman"/>
           <w:sz w:val="28"/>
         </w:rPr>
-        <w:t>4. Collaborate with educational experts to ensure AI Tutor remains up-to-date with the latest teaching methodologies and best practices.</w:t>
+        <w:t>4. Offer loyalty programs or membership benefits that incentivize repeat visits and foster long-term relationships with customers.</w:t>
       </w:r>
     </w:p>
     <w:p>
@@ -847,7 +631,7 @@
           <w:rFonts w:ascii="Times New Roman" w:hAnsi="Times New Roman"/>
           <w:sz w:val="28"/>
         </w:rPr>
-        <w:t>5. Develop gamification features to make learning more enjoyable and engaging, fostering long-term usage.</w:t>
+        <w:t>5. Collaborate with local fisheries and sustainable seafood organizations to support responsible fishing practices, enhancing the brand's reputation as a leader in sustainability.</w:t>
       </w:r>
     </w:p>
     <w:p>
@@ -856,7 +640,7 @@
           <w:rFonts w:ascii="Times New Roman" w:hAnsi="Times New Roman"/>
           <w:sz w:val="28"/>
         </w:rPr>
-        <w:t>6. Integrate AI Tutor with popular education platforms (Google Classroom, Canvas, Schoology) to seamlessly fit into users' existing workflows.</w:t>
+        <w:t>6. Explore opportunities for expansion to additional urban locations, capitalizing on the success of the initial market and meeting the growing demand for high-quality fresh seafood in cities without direct river access.</w:t>
       </w:r>
     </w:p>
     <w:p>
@@ -865,16 +649,7 @@
           <w:rFonts w:ascii="Times New Roman" w:hAnsi="Times New Roman"/>
           <w:sz w:val="28"/>
         </w:rPr>
-        <w:t>7. Offer premium features (advanced analytics, one-on-one tutoring sessions) for power users and schools.</w:t>
-      </w:r>
-    </w:p>
-    <w:p>
-      <w:r>
-        <w:rPr>
-          <w:rFonts w:ascii="Times New Roman" w:hAnsi="Times New Roman"/>
-          <w:sz w:val="28"/>
-        </w:rPr>
-        <w:t>8. Build a community around AI Tutor through forums, discussion groups, and live Q&amp;A sessions to foster engagement, support, and collaboration among users.</w:t>
+        <w:t>7. Stay informed about market trends and customer preferences, adapting marketing strategies and product offerings accordingly to maintain competitiveness and attract new customers.</w:t>
       </w:r>
     </w:p>
     <w:sectPr>

</xml_diff>